<commit_message>
Result Bimbingan Pak Aris : Bimbingan Ke 3
Pada bimbingan oleh Bapak Aris Sudaryanto S ST M T selaku Dosen Pembimbing 2 Saya menunjukkan prototipe dasar yang saya kerjakan dan menunjukan matriks untuk menguji kompatibiltas GDLC dengan projek tugas akhir yang saya kerjakan dan presentase kompatibiltasnya Adalah 96 Beliau menyampaikan untuk membuat sebuah list mapping fitur yang ada pada project saya
</commit_message>
<xml_diff>
--- a/File/Proposal Penugasan Akhir/Draft_Proposal_PA_SarjanaTerapan_A4 - Satria.docx
+++ b/File/Proposal Penugasan Akhir/Draft_Proposal_PA_SarjanaTerapan_A4 - Satria.docx
@@ -568,20 +568,17 @@
           <w:sz w:val="36"/>
           <w:szCs w:val="36"/>
         </w:rPr>
-        <w:t>NIP…………………</w:t>
-      </w:r>
-    </w:p>
-    <w:p>
-      <w:pPr>
-        <w:spacing w:after="0"/>
-        <w:jc w:val="center"/>
+        <w:t>NIP</w:t>
+      </w:r>
+      <w:r>
         <w:rPr>
           <w:rFonts w:cs="Times New Roman"/>
           <w:color w:val="000000" w:themeColor="text1"/>
           <w:sz w:val="36"/>
           <w:szCs w:val="36"/>
         </w:rPr>
-      </w:pPr>
+        <w:t xml:space="preserve"> 198106222008121003</w:t>
+      </w:r>
     </w:p>
     <w:p>
       <w:pPr>
@@ -594,17 +591,18 @@
           <w:szCs w:val="36"/>
         </w:rPr>
       </w:pPr>
-      <w:r>
+    </w:p>
+    <w:p>
+      <w:pPr>
+        <w:spacing w:after="0"/>
+        <w:jc w:val="center"/>
         <w:rPr>
           <w:rFonts w:cs="Times New Roman"/>
           <w:color w:val="000000" w:themeColor="text1"/>
           <w:sz w:val="36"/>
           <w:szCs w:val="36"/>
         </w:rPr>
-        <w:t xml:space="preserve">Aris </w:t>
-      </w:r>
-      <w:proofErr w:type="spellStart"/>
-      <w:proofErr w:type="gramStart"/>
+      </w:pPr>
       <w:r>
         <w:rPr>
           <w:rFonts w:cs="Times New Roman"/>
@@ -612,9 +610,10 @@
           <w:sz w:val="36"/>
           <w:szCs w:val="36"/>
         </w:rPr>
-        <w:t>Sudaryanto,S.ST</w:t>
-      </w:r>
-      <w:proofErr w:type="spellEnd"/>
+        <w:t xml:space="preserve">Aris </w:t>
+      </w:r>
+      <w:proofErr w:type="spellStart"/>
+      <w:proofErr w:type="gramStart"/>
       <w:r>
         <w:rPr>
           <w:rFonts w:cs="Times New Roman"/>
@@ -622,9 +621,9 @@
           <w:sz w:val="36"/>
           <w:szCs w:val="36"/>
         </w:rPr>
-        <w:t>.</w:t>
-      </w:r>
-      <w:proofErr w:type="gramEnd"/>
+        <w:t>Sudaryanto,S.ST</w:t>
+      </w:r>
+      <w:proofErr w:type="spellEnd"/>
       <w:r>
         <w:rPr>
           <w:rFonts w:cs="Times New Roman"/>
@@ -632,32 +631,30 @@
           <w:sz w:val="36"/>
           <w:szCs w:val="36"/>
         </w:rPr>
-        <w:t>, M.T</w:t>
-      </w:r>
-    </w:p>
-    <w:p>
-      <w:pPr>
-        <w:spacing w:after="0"/>
-        <w:jc w:val="center"/>
+        <w:t>.</w:t>
+      </w:r>
+      <w:proofErr w:type="gramEnd"/>
+      <w:r>
         <w:rPr>
           <w:rFonts w:cs="Times New Roman"/>
           <w:color w:val="000000" w:themeColor="text1"/>
           <w:sz w:val="36"/>
           <w:szCs w:val="36"/>
         </w:rPr>
-      </w:pPr>
-      <w:r>
+        <w:t>, M.T</w:t>
+      </w:r>
+    </w:p>
+    <w:p>
+      <w:pPr>
+        <w:spacing w:after="0"/>
+        <w:jc w:val="center"/>
         <w:rPr>
           <w:rFonts w:cs="Times New Roman"/>
           <w:color w:val="000000" w:themeColor="text1"/>
           <w:sz w:val="36"/>
           <w:szCs w:val="36"/>
         </w:rPr>
-        <w:t>NIP</w:t>
-      </w:r>
-      <w:r>
-        <w:t xml:space="preserve"> </w:t>
-      </w:r>
+      </w:pPr>
       <w:r>
         <w:rPr>
           <w:rFonts w:cs="Times New Roman"/>
@@ -665,20 +662,20 @@
           <w:sz w:val="36"/>
           <w:szCs w:val="36"/>
         </w:rPr>
-        <w:t>199106152022031004</w:t>
-      </w:r>
-    </w:p>
-    <w:p>
-      <w:pPr>
-        <w:spacing w:after="0"/>
-        <w:jc w:val="center"/>
+        <w:t>NIP</w:t>
+      </w:r>
+      <w:r>
+        <w:t xml:space="preserve"> </w:t>
+      </w:r>
+      <w:r>
         <w:rPr>
           <w:rFonts w:cs="Times New Roman"/>
           <w:color w:val="000000" w:themeColor="text1"/>
           <w:sz w:val="36"/>
           <w:szCs w:val="36"/>
         </w:rPr>
-      </w:pPr>
+        <w:t>199106152022031004</w:t>
+      </w:r>
     </w:p>
     <w:p>
       <w:pPr>
@@ -707,7 +704,6 @@
     <w:p>
       <w:pPr>
         <w:spacing w:after="0"/>
-        <w:jc w:val="center"/>
         <w:rPr>
           <w:rFonts w:cs="Times New Roman"/>
           <w:color w:val="000000" w:themeColor="text1"/>
@@ -844,7 +840,6 @@
           <w:sz w:val="36"/>
           <w:szCs w:val="36"/>
         </w:rPr>
-        <w:lastRenderedPageBreak/>
         <w:t>2025</w:t>
       </w:r>
       <w:r>
@@ -3514,10 +3509,20 @@
           <w:lang w:val="id"/>
         </w:rPr>
       </w:pPr>
-      <w:r>
-        <w:rPr>
-          <w:lang w:val="id"/>
-        </w:rPr>
+    </w:p>
+    <w:p>
+      <w:pPr>
+        <w:ind w:firstLine="360"/>
+        <w:jc w:val="both"/>
+        <w:rPr>
+          <w:lang w:val="id"/>
+        </w:rPr>
+      </w:pPr>
+      <w:r>
+        <w:rPr>
+          <w:lang w:val="id"/>
+        </w:rPr>
+        <w:lastRenderedPageBreak/>
         <w:t xml:space="preserve">Untuk kutipan langsung dan pendek (1-2 baris), cara penulisan rujukan untuk kutipan dilakukan dengan memberikan tanda petik ganda di awal dan akhir kutipan dan ditulis miring dan kemudian diiringi dengan sumber referensi pada daftar pustaka, seperti ini </w:t>
       </w:r>
       <w:r>
@@ -3525,15 +3530,7 @@
           <w:i/>
           <w:lang w:val="id"/>
         </w:rPr>
-        <w:t xml:space="preserve">"Ini contoh </w:t>
-      </w:r>
-      <w:r>
-        <w:rPr>
-          <w:i/>
-          <w:lang w:val="id"/>
-        </w:rPr>
-        <w:lastRenderedPageBreak/>
-        <w:t xml:space="preserve">penulisan rujukan untuk kutipan langsung dan pendek" </w:t>
+        <w:t xml:space="preserve">"Ini contoh penulisan rujukan untuk kutipan langsung dan pendek" </w:t>
       </w:r>
       <w:r>
         <w:rPr>
@@ -4900,35 +4897,37 @@
       </w:pPr>
       <w:r>
         <w:rPr>
-          <w:lang w:val="id"/>
-        </w:rPr>
-        <w:t xml:space="preserve">Nama_Pengarang1, Nama_Pengarang2, </w:t>
-      </w:r>
-      <w:r>
-        <w:rPr>
-          <w:b/>
-          <w:lang w:val="id"/>
-        </w:rPr>
-        <w:t>Judul Makalah Jurnal Internasional atau Nasional</w:t>
-      </w:r>
-      <w:r>
-        <w:rPr>
-          <w:lang w:val="id"/>
+          <w:rFonts w:cs="Times New Roman"/>
+        </w:rPr>
+        <w:t xml:space="preserve">Krebs, E., Beckmann, T., Geier, L., Ramson, S., &amp; Hirschfeld, R. (2023). Pronto: Prototyping a Prototyping Tool for Game Mechanic Prototyping. </w:t>
+      </w:r>
+      <w:r>
+        <w:rPr>
+          <w:rFonts w:cs="Times New Roman"/>
+          <w:i/>
+          <w:iCs/>
+        </w:rPr>
+        <w:t>PPIG 2023 Proceedings</w:t>
+      </w:r>
+      <w:r>
+        <w:rPr>
+          <w:rFonts w:cs="Times New Roman"/>
         </w:rPr>
         <w:t xml:space="preserve">, </w:t>
       </w:r>
       <w:r>
         <w:rPr>
+          <w:rFonts w:cs="Times New Roman"/>
           <w:i/>
-          <w:lang w:val="id"/>
-        </w:rPr>
-        <w:t>Nama Jurnal</w:t>
-      </w:r>
-      <w:r>
-        <w:rPr>
-          <w:lang w:val="id"/>
-        </w:rPr>
-        <w:t>, Vol. xx, No. yy, Hal. aa- bb, Penerbit, Tahun.</w:t>
+          <w:iCs/>
+        </w:rPr>
+        <w:t>34</w:t>
+      </w:r>
+      <w:r>
+        <w:rPr>
+          <w:rFonts w:cs="Times New Roman"/>
+        </w:rPr>
+        <w:t>, 157-168.</w:t>
       </w:r>
     </w:p>
     <w:p>
@@ -4946,35 +4945,51 @@
       </w:pPr>
       <w:r>
         <w:rPr>
-          <w:lang w:val="id"/>
-        </w:rPr>
-        <w:t xml:space="preserve">Nama_Pengarang1, Nama_Pengarang2, </w:t>
-      </w:r>
-      <w:r>
-        <w:rPr>
-          <w:b/>
-          <w:lang w:val="id"/>
-        </w:rPr>
-        <w:t>Judul Makalah Seminar Internasional atau Nasional</w:t>
-      </w:r>
-      <w:r>
-        <w:rPr>
-          <w:lang w:val="id"/>
+          <w:rFonts w:cs="Times New Roman"/>
+        </w:rPr>
+        <w:t xml:space="preserve">Lazaridis, L., &amp; </w:t>
+      </w:r>
+      <w:proofErr w:type="spellStart"/>
+      <w:r>
+        <w:rPr>
+          <w:rFonts w:cs="Times New Roman"/>
+        </w:rPr>
+        <w:t>Fragulis</w:t>
+      </w:r>
+      <w:proofErr w:type="spellEnd"/>
+      <w:r>
+        <w:rPr>
+          <w:rFonts w:cs="Times New Roman"/>
+        </w:rPr>
+        <w:t xml:space="preserve">, G. F. (2024). Creating a newer and improved procedural content generation (PCG) algorithm with minimal human intervention for computer gaming development. </w:t>
+      </w:r>
+      <w:r>
+        <w:rPr>
+          <w:rFonts w:cs="Times New Roman"/>
+          <w:i/>
+          <w:iCs/>
+        </w:rPr>
+        <w:t>Computers</w:t>
+      </w:r>
+      <w:r>
+        <w:rPr>
+          <w:rFonts w:cs="Times New Roman"/>
         </w:rPr>
         <w:t xml:space="preserve">, </w:t>
       </w:r>
       <w:r>
         <w:rPr>
+          <w:rFonts w:cs="Times New Roman"/>
           <w:i/>
-          <w:lang w:val="id"/>
-        </w:rPr>
-        <w:t>Nama Seminar</w:t>
-      </w:r>
-      <w:r>
-        <w:rPr>
-          <w:lang w:val="id"/>
-        </w:rPr>
-        <w:t>, Tempat, Hal. aa-bb, Tahun.</w:t>
+          <w:iCs/>
+        </w:rPr>
+        <w:t>13</w:t>
+      </w:r>
+      <w:r>
+        <w:rPr>
+          <w:rFonts w:cs="Times New Roman"/>
+        </w:rPr>
+        <w:t>(11), 304.</w:t>
       </w:r>
     </w:p>
     <w:p>
@@ -4992,35 +5007,43 @@
       </w:pPr>
       <w:r>
         <w:rPr>
-          <w:lang w:val="id"/>
-        </w:rPr>
-        <w:t xml:space="preserve">Nama_Pengarang1, Nama Pengarang2, </w:t>
-      </w:r>
-      <w:r>
-        <w:rPr>
-          <w:b/>
-          <w:lang w:val="id"/>
-        </w:rPr>
-        <w:t>Judul Buku Acuan</w:t>
-      </w:r>
-      <w:r>
-        <w:rPr>
-          <w:lang w:val="id"/>
+          <w:rFonts w:cs="Times New Roman"/>
+        </w:rPr>
+        <w:t xml:space="preserve">Widjaja, J. A., Jefferson, L., Siahaan, M. F. B., &amp; Chow, A. (2024). Utilizing game development life cycle method to develop an educational game for basic mathematics using Unity 2D game engine. </w:t>
+      </w:r>
+      <w:r>
+        <w:rPr>
+          <w:rFonts w:cs="Times New Roman"/>
+          <w:i/>
+          <w:iCs/>
+        </w:rPr>
+        <w:t>IJISIT: International Journal of Computer Science and Information Technology</w:t>
+      </w:r>
+      <w:r>
+        <w:rPr>
+          <w:rFonts w:cs="Times New Roman"/>
         </w:rPr>
         <w:t xml:space="preserve">, </w:t>
       </w:r>
       <w:r>
         <w:rPr>
+          <w:rFonts w:cs="Times New Roman"/>
           <w:i/>
-          <w:lang w:val="id"/>
-        </w:rPr>
-        <w:t>Penerbit</w:t>
-      </w:r>
-      <w:r>
-        <w:rPr>
-          <w:lang w:val="id"/>
-        </w:rPr>
-        <w:t>, Edisi xx, Tahun.</w:t>
+          <w:iCs/>
+        </w:rPr>
+        <w:t>1</w:t>
+      </w:r>
+      <w:r>
+        <w:rPr>
+          <w:rFonts w:cs="Times New Roman"/>
+        </w:rPr>
+        <w:t>(1), 20-30</w:t>
+      </w:r>
+      <w:r>
+        <w:rPr>
+          <w:lang w:val="id"/>
+        </w:rPr>
+        <w:t>.</w:t>
       </w:r>
     </w:p>
     <w:p>
@@ -5038,35 +5061,57 @@
       </w:pPr>
       <w:r>
         <w:rPr>
-          <w:lang w:val="id"/>
-        </w:rPr>
-        <w:t xml:space="preserve">Nama_Mahasiswa_Penulis, </w:t>
-      </w:r>
-      <w:r>
-        <w:rPr>
-          <w:b/>
-          <w:lang w:val="id"/>
-        </w:rPr>
-        <w:t>Judul Buku Proyek Akhir, Proyek akhir atau Disertasi</w:t>
-      </w:r>
-      <w:r>
-        <w:rPr>
-          <w:lang w:val="id"/>
-        </w:rPr>
-        <w:t xml:space="preserve">, Proyek Akhir/Skripsi/Proyek akhir/Disertasi, </w:t>
-      </w:r>
-      <w:r>
-        <w:rPr>
+          <w:rFonts w:cs="Times New Roman"/>
+        </w:rPr>
+        <w:t xml:space="preserve">Rubio, C., Barriga, N. A., Ingram, B., Luna-García, H., &amp; </w:t>
+      </w:r>
+      <w:proofErr w:type="spellStart"/>
+      <w:r>
+        <w:rPr>
+          <w:rFonts w:cs="Times New Roman"/>
+        </w:rPr>
+        <w:t>Besoain</w:t>
+      </w:r>
+      <w:proofErr w:type="spellEnd"/>
+      <w:r>
+        <w:rPr>
+          <w:rFonts w:cs="Times New Roman"/>
+        </w:rPr>
+        <w:t xml:space="preserve">, F. (2025). Exploring Procedural Content Generation of Environments for Virtual Museums: A Mixed-Initiative Approach. </w:t>
+      </w:r>
+      <w:r>
+        <w:rPr>
+          <w:rFonts w:cs="Times New Roman"/>
           <w:i/>
-          <w:lang w:val="id"/>
-        </w:rPr>
-        <w:t>Perguruan Tinggi</w:t>
-      </w:r>
-      <w:r>
-        <w:rPr>
-          <w:lang w:val="id"/>
-        </w:rPr>
-        <w:t>, Tahun.</w:t>
+          <w:iCs/>
+        </w:rPr>
+        <w:t>Heritage</w:t>
+      </w:r>
+      <w:r>
+        <w:rPr>
+          <w:rFonts w:cs="Times New Roman"/>
+        </w:rPr>
+        <w:t xml:space="preserve">, </w:t>
+      </w:r>
+      <w:r>
+        <w:rPr>
+          <w:rFonts w:cs="Times New Roman"/>
+          <w:i/>
+          <w:iCs/>
+        </w:rPr>
+        <w:t>8</w:t>
+      </w:r>
+      <w:r>
+        <w:rPr>
+          <w:rFonts w:cs="Times New Roman"/>
+        </w:rPr>
+        <w:t>(4), 134</w:t>
+      </w:r>
+      <w:r>
+        <w:rPr>
+          <w:lang w:val="id"/>
+        </w:rPr>
+        <w:t>.</w:t>
       </w:r>
     </w:p>
     <w:p>
@@ -5084,35 +5129,29 @@
       </w:pPr>
       <w:r>
         <w:rPr>
-          <w:lang w:val="id"/>
-        </w:rPr>
-        <w:t xml:space="preserve">Nama_Penulis, </w:t>
-      </w:r>
-      <w:r>
-        <w:rPr>
-          <w:b/>
-          <w:lang w:val="id"/>
-        </w:rPr>
-        <w:t>Judul Tulisan pada Media Publik</w:t>
-      </w:r>
-      <w:r>
-        <w:rPr>
-          <w:lang w:val="id"/>
-        </w:rPr>
-        <w:t xml:space="preserve">, </w:t>
-      </w:r>
-      <w:r>
-        <w:rPr>
+          <w:rFonts w:cs="Times New Roman"/>
+        </w:rPr>
+        <w:t xml:space="preserve">Krebs, E., Beckmann, T., Geier, L., Grenda, J., Ramson, S., &amp; Hirschfeld, R. (2025, April). All in One: Rapid Game Prototyping in a Single View. In </w:t>
+      </w:r>
+      <w:r>
+        <w:rPr>
+          <w:rFonts w:cs="Times New Roman"/>
           <w:i/>
-          <w:lang w:val="id"/>
-        </w:rPr>
-        <w:t>Nama Media Publik</w:t>
-      </w:r>
-      <w:r>
-        <w:rPr>
-          <w:lang w:val="id"/>
-        </w:rPr>
-        <w:t>, Tanggal/Bulan...., Edisi  , Tahun.</w:t>
+          <w:iCs/>
+        </w:rPr>
+        <w:t>Proceedings of the 2025 CHI Conference on Human Factors in Computing Systems</w:t>
+      </w:r>
+      <w:r>
+        <w:rPr>
+          <w:rFonts w:cs="Times New Roman"/>
+        </w:rPr>
+        <w:t xml:space="preserve"> (pp. 1-17)</w:t>
+      </w:r>
+      <w:r>
+        <w:rPr>
+          <w:lang w:val="id"/>
+        </w:rPr>
+        <w:t>.</w:t>
       </w:r>
     </w:p>
     <w:p>
@@ -5125,43 +5164,197 @@
         <w:ind w:left="360"/>
         <w:jc w:val="both"/>
       </w:pPr>
-      <w:r>
-        <w:rPr>
-          <w:lang w:val="id"/>
-        </w:rPr>
-        <w:t xml:space="preserve">Nama_Penulis, </w:t>
-      </w:r>
-      <w:r>
-        <w:rPr>
-          <w:b/>
-          <w:lang w:val="id"/>
-        </w:rPr>
-        <w:t>Judul Tulisan pada Media Online</w:t>
-      </w:r>
-      <w:r>
-        <w:rPr>
-          <w:lang w:val="id"/>
-        </w:rPr>
-        <w:t xml:space="preserve">, Wikipedia/Nama Ensiklopedia online atau Nama Blog, </w:t>
-      </w:r>
-      <w:r>
-        <w:rPr>
+      <w:proofErr w:type="spellStart"/>
+      <w:r>
+        <w:rPr>
+          <w:rFonts w:cs="Times New Roman"/>
+        </w:rPr>
+        <w:t>Oktaviani</w:t>
+      </w:r>
+      <w:proofErr w:type="spellEnd"/>
+      <w:r>
+        <w:rPr>
+          <w:rFonts w:cs="Times New Roman"/>
+        </w:rPr>
+        <w:t xml:space="preserve">, Y. C., Wahyuningsih, Y., &amp; </w:t>
+      </w:r>
+      <w:proofErr w:type="spellStart"/>
+      <w:r>
+        <w:rPr>
+          <w:rFonts w:cs="Times New Roman"/>
+        </w:rPr>
+        <w:t>Kristianto</w:t>
+      </w:r>
+      <w:proofErr w:type="spellEnd"/>
+      <w:r>
+        <w:rPr>
+          <w:rFonts w:cs="Times New Roman"/>
+        </w:rPr>
+        <w:t xml:space="preserve">, R. P. (2025). Application of the Game Development Life Cycle (GDLC) Model in Design and Development of Educational Games for Dyslexic Children. </w:t>
+      </w:r>
+      <w:r>
+        <w:rPr>
+          <w:rFonts w:cs="Times New Roman"/>
           <w:i/>
-          <w:lang w:val="id"/>
-        </w:rPr>
-        <w:t>Alamat internet</w:t>
-      </w:r>
-      <w:r>
-        <w:rPr>
-          <w:lang w:val="id"/>
-        </w:rPr>
-        <w:t>, Diakses tanggal.  , Tah</w:t>
-      </w:r>
-      <w:r>
-        <w:rPr>
-          <w:lang w:val="id"/>
-        </w:rPr>
-        <w:t>un</w:t>
+          <w:iCs/>
+        </w:rPr>
+        <w:t>Social Science and Humanities Journal</w:t>
+      </w:r>
+      <w:r>
+        <w:rPr>
+          <w:rFonts w:cs="Times New Roman"/>
+        </w:rPr>
+        <w:t xml:space="preserve">, </w:t>
+      </w:r>
+      <w:r>
+        <w:rPr>
+          <w:rFonts w:cs="Times New Roman"/>
+          <w:i/>
+          <w:iCs/>
+        </w:rPr>
+        <w:t>9</w:t>
+      </w:r>
+      <w:r>
+        <w:rPr>
+          <w:rFonts w:cs="Times New Roman"/>
+        </w:rPr>
+        <w:t>(01), 6477-6487</w:t>
+      </w:r>
+    </w:p>
+    <w:p>
+      <w:pPr>
+        <w:pStyle w:val="ListParagraph"/>
+        <w:numPr>
+          <w:ilvl w:val="6"/>
+          <w:numId w:val="8"/>
+        </w:numPr>
+        <w:ind w:left="360"/>
+        <w:jc w:val="both"/>
+      </w:pPr>
+      <w:r>
+        <w:rPr>
+          <w:rFonts w:cs="Times New Roman"/>
+        </w:rPr>
+        <w:t>Roedavan, Rickman &amp; Geovani, Naya. (2024). GAME DEVELOPMENT LIFE CYCLE</w:t>
+      </w:r>
+      <w:r>
+        <w:rPr>
+          <w:rFonts w:cs="Times New Roman"/>
+        </w:rPr>
+        <w:t>.</w:t>
+      </w:r>
+    </w:p>
+    <w:p>
+      <w:pPr>
+        <w:pStyle w:val="ListParagraph"/>
+        <w:numPr>
+          <w:ilvl w:val="6"/>
+          <w:numId w:val="8"/>
+        </w:numPr>
+        <w:ind w:left="360"/>
+        <w:jc w:val="both"/>
+      </w:pPr>
+      <w:r>
+        <w:rPr>
+          <w:rFonts w:cs="Times New Roman"/>
+        </w:rPr>
+        <w:t xml:space="preserve">Mahadi, Aisyah Beningsari, et al. "Optimizing 3D Low-Poly Asset Production Standards for Village Meow 2.5 D Game Using GDLC with Expert." </w:t>
+      </w:r>
+      <w:r>
+        <w:rPr>
+          <w:rFonts w:cs="Times New Roman"/>
+          <w:i/>
+          <w:iCs/>
+        </w:rPr>
+        <w:t>Proceedings of the 8th International Conference on Applied Engineering (ICAE 2025)</w:t>
+      </w:r>
+      <w:r>
+        <w:rPr>
+          <w:rFonts w:cs="Times New Roman"/>
+        </w:rPr>
+        <w:t>. Springer Nature, 2025</w:t>
+      </w:r>
+    </w:p>
+    <w:p>
+      <w:pPr>
+        <w:pStyle w:val="ListParagraph"/>
+        <w:numPr>
+          <w:ilvl w:val="6"/>
+          <w:numId w:val="8"/>
+        </w:numPr>
+        <w:ind w:left="360"/>
+        <w:jc w:val="both"/>
+      </w:pPr>
+      <w:proofErr w:type="spellStart"/>
+      <w:r>
+        <w:rPr>
+          <w:rFonts w:cs="Times New Roman"/>
+        </w:rPr>
+        <w:t>Linåker</w:t>
+      </w:r>
+      <w:proofErr w:type="spellEnd"/>
+      <w:r>
+        <w:rPr>
+          <w:rFonts w:cs="Times New Roman"/>
+        </w:rPr>
+        <w:t xml:space="preserve">, Johan, Elizabeth Bjarnason, and Fabian Fagerholm. "Pre-release experimentation in indie game development: an interview survey." </w:t>
+      </w:r>
+      <w:r>
+        <w:rPr>
+          <w:rFonts w:cs="Times New Roman"/>
+          <w:i/>
+          <w:iCs/>
+        </w:rPr>
+        <w:t>International Conference on Software Business</w:t>
+      </w:r>
+      <w:r>
+        <w:rPr>
+          <w:rFonts w:cs="Times New Roman"/>
+        </w:rPr>
+        <w:t>. Cham: Springer Nature Switzerland, 2024</w:t>
+      </w:r>
+      <w:r>
+        <w:rPr>
+          <w:rFonts w:cs="Times New Roman"/>
+        </w:rPr>
+        <w:t>.</w:t>
+      </w:r>
+    </w:p>
+    <w:p>
+      <w:pPr>
+        <w:pStyle w:val="ListParagraph"/>
+        <w:numPr>
+          <w:ilvl w:val="6"/>
+          <w:numId w:val="8"/>
+        </w:numPr>
+        <w:ind w:left="360"/>
+        <w:jc w:val="both"/>
+      </w:pPr>
+      <w:r>
+        <w:rPr>
+          <w:rFonts w:cs="Times New Roman"/>
+        </w:rPr>
+        <w:t xml:space="preserve">Racheed, Abdulrahman, and Garcia Martinez Iker Garcia Martinez. "The Use </w:t>
+      </w:r>
+      <w:proofErr w:type="gramStart"/>
+      <w:r>
+        <w:rPr>
+          <w:rFonts w:cs="Times New Roman"/>
+        </w:rPr>
+        <w:t>Of</w:t>
+      </w:r>
+      <w:proofErr w:type="gramEnd"/>
+      <w:r>
+        <w:rPr>
+          <w:rFonts w:cs="Times New Roman"/>
+        </w:rPr>
+        <w:t xml:space="preserve"> Software Product Lines in Game Development." (2025</w:t>
+      </w:r>
+      <w:r>
+        <w:rPr>
+          <w:rFonts w:cs="Times New Roman"/>
+        </w:rPr>
+        <w:t>).</w:t>
       </w:r>
     </w:p>
     <w:sectPr>

</xml_diff>